<commit_message>
Updated docs: updated screenshots, added image from desmos
</commit_message>
<xml_diff>
--- a/docs/Силинцев Владислав Лаб 1 P3314.docx
+++ b/docs/Силинцев Владислав Лаб 1 P3314.docx
@@ -11,10 +11,6 @@
         <w:rPr/>
       </w:pPr>
       <w:r>
-        <w:rPr>
-          <w:rFonts w:eastAsia="Times New Roman" w:cs="Times New Roman"/>
-          <w:szCs w:val="28"/>
-        </w:rPr>
         <mc:AlternateContent>
           <mc:Choice Requires="wps">
             <w:drawing>
@@ -64,7 +60,9 @@
                               </w:rPr>
                             </w:pPr>
                             <w:r>
-                              <w:rPr/>
+                              <w:rPr>
+                                <w:color w:val="000000"/>
+                              </w:rPr>
                             </w:r>
                           </w:p>
                         </w:txbxContent>
@@ -80,8 +78,8 @@
           </mc:Choice>
           <mc:Fallback>
             <w:pict>
-              <v:rect id="shape_0" ID="Врезка1" path="m0,0l-2147483645,0l-2147483645,-2147483646l0,-2147483646xe" fillcolor="white" stroked="f" o:allowincell="f" style="position:absolute;margin-left:-16.8pt;margin-top:0.05pt;width:16.75pt;height:16.75pt;mso-wrap-style:none;v-text-anchor:middle">
-                <v:fill o:detectmouseclick="t" type="solid" color2="black" opacity="0"/>
+              <v:rect id="shape_0" ID="Врезка1" path="m0,0l-2147483645,0l-2147483645,-2147483646l0,-2147483646xe" stroked="f" o:allowincell="f" style="position:absolute;margin-left:-16.8pt;margin-top:0.05pt;width:16.75pt;height:16.75pt;mso-wrap-style:none;v-text-anchor:middle">
+                <v:fill o:detectmouseclick="t" on="false"/>
                 <v:stroke color="#3465a4" joinstyle="round" endcap="flat"/>
                 <v:textbox>
                   <w:txbxContent>
@@ -94,7 +92,9 @@
                         </w:rPr>
                       </w:pPr>
                       <w:r>
-                        <w:rPr/>
+                        <w:rPr>
+                          <w:color w:val="000000"/>
+                        </w:rPr>
                       </w:r>
                     </w:p>
                   </w:txbxContent>
@@ -153,7 +153,9 @@
                               </w:rPr>
                             </w:pPr>
                             <w:r>
-                              <w:rPr/>
+                              <w:rPr>
+                                <w:color w:val="000000"/>
+                              </w:rPr>
                             </w:r>
                           </w:p>
                         </w:txbxContent>
@@ -169,8 +171,8 @@
           </mc:Choice>
           <mc:Fallback>
             <w:pict>
-              <v:rect id="shape_0" ID="Врезка2" path="m0,0l-2147483645,0l-2147483645,-2147483646l0,-2147483646xe" fillcolor="white" stroked="f" o:allowincell="f" style="position:absolute;margin-left:-16.8pt;margin-top:0.05pt;width:16.75pt;height:16.75pt;mso-wrap-style:none;v-text-anchor:middle">
-                <v:fill o:detectmouseclick="t" type="solid" color2="black" opacity="0"/>
+              <v:rect id="shape_0" ID="Врезка2" path="m0,0l-2147483645,0l-2147483645,-2147483646l0,-2147483646xe" stroked="f" o:allowincell="f" style="position:absolute;margin-left:-16.8pt;margin-top:0.05pt;width:16.75pt;height:16.75pt;mso-wrap-style:none;v-text-anchor:middle">
+                <v:fill o:detectmouseclick="t" on="false"/>
                 <v:stroke color="#3465a4" joinstyle="round" endcap="flat"/>
                 <v:textbox>
                   <w:txbxContent>
@@ -183,7 +185,9 @@
                         </w:rPr>
                       </w:pPr>
                       <w:r>
-                        <w:rPr/>
+                        <w:rPr>
+                          <w:color w:val="000000"/>
+                        </w:rPr>
                       </w:r>
                     </w:p>
                   </w:txbxContent>
@@ -242,7 +246,9 @@
                               </w:rPr>
                             </w:pPr>
                             <w:r>
-                              <w:rPr/>
+                              <w:rPr>
+                                <w:color w:val="000000"/>
+                              </w:rPr>
                             </w:r>
                           </w:p>
                         </w:txbxContent>
@@ -258,8 +264,8 @@
           </mc:Choice>
           <mc:Fallback>
             <w:pict>
-              <v:rect id="shape_0" ID="Врезка3" path="m0,0l-2147483645,0l-2147483645,-2147483646l0,-2147483646xe" fillcolor="white" stroked="f" o:allowincell="f" style="position:absolute;margin-left:-16.8pt;margin-top:0.05pt;width:16.75pt;height:16.75pt;mso-wrap-style:none;v-text-anchor:middle">
-                <v:fill o:detectmouseclick="t" type="solid" color2="black" opacity="0"/>
+              <v:rect id="shape_0" ID="Врезка3" path="m0,0l-2147483645,0l-2147483645,-2147483646l0,-2147483646xe" stroked="f" o:allowincell="f" style="position:absolute;margin-left:-16.8pt;margin-top:0.05pt;width:16.75pt;height:16.75pt;mso-wrap-style:none;v-text-anchor:middle">
+                <v:fill o:detectmouseclick="t" on="false"/>
                 <v:stroke color="#3465a4" joinstyle="round" endcap="flat"/>
                 <v:textbox>
                   <w:txbxContent>
@@ -272,7 +278,9 @@
                         </w:rPr>
                       </w:pPr>
                       <w:r>
-                        <w:rPr/>
+                        <w:rPr>
+                          <w:color w:val="000000"/>
+                        </w:rPr>
                       </w:r>
                     </w:p>
                   </w:txbxContent>
@@ -693,9 +701,7 @@
         <w:t xml:space="preserve">«Цветная» сила излучения источника под углом к оси источника света: </w:t>
       </w:r>
       <w:r>
-        <w:rPr>
-          <w:lang w:val="ru-RU"/>
-        </w:rPr>
+        <w:rPr/>
       </w:r>
       <m:oMath xmlns:m="http://schemas.openxmlformats.org/officeDocument/2006/math">
         <m:r>
@@ -795,9 +801,7 @@
         <w:t xml:space="preserve">, где </w:t>
       </w:r>
       <w:r>
-        <w:rPr>
-          <w:lang w:val="ru-RU"/>
-        </w:rPr>
+        <w:rPr/>
       </w:r>
       <m:oMath xmlns:m="http://schemas.openxmlformats.org/officeDocument/2006/math">
         <m:sSub>
@@ -840,9 +844,7 @@
         <w:t xml:space="preserve"> – «цветная» сила излучения источника света в направлении его оси </w:t>
       </w:r>
       <w:r>
-        <w:rPr>
-          <w:lang w:val="ru-RU"/>
-        </w:rPr>
+        <w:rPr/>
       </w:r>
       <m:oMath xmlns:m="http://schemas.openxmlformats.org/officeDocument/2006/math">
         <m:acc>
@@ -866,9 +868,7 @@
         <w:t xml:space="preserve">. </w:t>
       </w:r>
       <w:r>
-        <w:rPr>
-          <w:lang w:val="ru-RU"/>
-        </w:rPr>
+        <w:rPr/>
       </w:r>
       <m:oMath xmlns:m="http://schemas.openxmlformats.org/officeDocument/2006/math">
         <m:r>
@@ -916,9 +916,7 @@
         <w:t xml:space="preserve">«Цветная» освещенность точки: </w:t>
       </w:r>
       <w:r>
-        <w:rPr>
-          <w:lang w:val="ru-RU"/>
-        </w:rPr>
+        <w:rPr/>
       </w:r>
       <m:oMath xmlns:m="http://schemas.openxmlformats.org/officeDocument/2006/math">
         <m:r>
@@ -1061,9 +1059,7 @@
         <w:t xml:space="preserve">, где </w:t>
       </w:r>
       <w:r>
-        <w:rPr>
-          <w:lang w:val="ru-RU"/>
-        </w:rPr>
+        <w:rPr/>
       </w:r>
       <m:oMath xmlns:m="http://schemas.openxmlformats.org/officeDocument/2006/math">
         <m:r>
@@ -1125,9 +1121,7 @@
         <w:t xml:space="preserve">«цветная» сила излучения света, </w:t>
       </w:r>
       <w:r>
-        <w:rPr>
-          <w:lang w:val="ru-RU"/>
-        </w:rPr>
+        <w:rPr/>
       </w:r>
       <m:oMath xmlns:m="http://schemas.openxmlformats.org/officeDocument/2006/math">
         <m:r>
@@ -1156,9 +1150,7 @@
         <w:t xml:space="preserve">угол между направлением света и нормалью к освещаемой поверхности, </w:t>
       </w:r>
       <w:r>
-        <w:rPr>
-          <w:lang w:val="ru-RU"/>
-        </w:rPr>
+        <w:rPr/>
       </w:r>
       <m:oMath xmlns:m="http://schemas.openxmlformats.org/officeDocument/2006/math">
         <m:r>
@@ -1194,9 +1186,7 @@
         <w:t xml:space="preserve">Перевод локальных координат точки в плоскости в глобальные: </w:t>
       </w:r>
       <w:r>
-        <w:rPr>
-          <w:lang w:val="ru-RU"/>
-        </w:rPr>
+        <w:rPr/>
       </w:r>
       <m:oMath xmlns:m="http://schemas.openxmlformats.org/officeDocument/2006/math">
         <m:acc>
@@ -1559,9 +1549,7 @@
         <w:t xml:space="preserve">, где </w:t>
       </w:r>
       <w:r>
-        <w:rPr>
-          <w:lang w:val="ru-RU"/>
-        </w:rPr>
+        <w:rPr/>
       </w:r>
       <m:oMath xmlns:m="http://schemas.openxmlformats.org/officeDocument/2006/math">
         <m:r>
@@ -1578,9 +1566,7 @@
         <w:t xml:space="preserve"> и </w:t>
       </w:r>
       <w:r>
-        <w:rPr>
-          <w:lang w:val="ru-RU"/>
-        </w:rPr>
+        <w:rPr/>
       </w:r>
       <m:oMath xmlns:m="http://schemas.openxmlformats.org/officeDocument/2006/math">
         <m:r>
@@ -1616,9 +1602,7 @@
         <w:t xml:space="preserve">Вычисление вектора нормали плоскости треугольника через 3 точки: </w:t>
       </w:r>
       <w:r>
-        <w:rPr>
-          <w:lang w:val="ru-RU"/>
-        </w:rPr>
+        <w:rPr/>
       </w:r>
       <m:oMath xmlns:m="http://schemas.openxmlformats.org/officeDocument/2006/math">
         <m:acc>
@@ -1949,9 +1933,7 @@
         <w:t xml:space="preserve">Вектор от точки плоскости до источника света: </w:t>
       </w:r>
       <w:r>
-        <w:rPr>
-          <w:lang w:val="ru-RU"/>
-        </w:rPr>
+        <w:rPr/>
       </w:r>
       <m:oMath xmlns:m="http://schemas.openxmlformats.org/officeDocument/2006/math">
         <m:acc>
@@ -2037,9 +2019,7 @@
         <w:t xml:space="preserve">, </w:t>
       </w:r>
       <w:r>
-        <w:rPr>
-          <w:lang w:val="ru-RU"/>
-        </w:rPr>
+        <w:rPr/>
       </w:r>
       <m:oMath xmlns:m="http://schemas.openxmlformats.org/officeDocument/2006/math">
         <m:sSup>
@@ -2107,9 +2087,7 @@
         <w:t xml:space="preserve">, </w:t>
       </w:r>
       <w:r>
-        <w:rPr>
-          <w:lang w:val="ru-RU"/>
-        </w:rPr>
+        <w:rPr/>
       </w:r>
       <m:oMath xmlns:m="http://schemas.openxmlformats.org/officeDocument/2006/math">
         <m:r>
@@ -2197,9 +2175,7 @@
         <w:t xml:space="preserve">, </w:t>
       </w:r>
       <w:r>
-        <w:rPr>
-          <w:lang w:val="ru-RU"/>
-        </w:rPr>
+        <w:rPr/>
       </w:r>
       <m:oMath xmlns:m="http://schemas.openxmlformats.org/officeDocument/2006/math">
         <m:r>
@@ -2306,9 +2282,7 @@
         <w:t xml:space="preserve">Яркость точки: </w:t>
       </w:r>
       <w:r>
-        <w:rPr>
-          <w:lang w:val="ru-RU"/>
-        </w:rPr>
+        <w:rPr/>
       </w:r>
       <m:oMath xmlns:m="http://schemas.openxmlformats.org/officeDocument/2006/math">
         <m:r>
@@ -2620,9 +2594,7 @@
         <w:t xml:space="preserve">, где </w:t>
       </w:r>
       <w:r>
-        <w:rPr>
-          <w:lang w:val="ru-RU"/>
-        </w:rPr>
+        <w:rPr/>
       </w:r>
       <m:oMath xmlns:m="http://schemas.openxmlformats.org/officeDocument/2006/math">
         <m:sSub>
@@ -2720,9 +2692,7 @@
         <w:t xml:space="preserve">го источника света, </w:t>
       </w:r>
       <w:r>
-        <w:rPr>
-          <w:lang w:val="ru-RU"/>
-        </w:rPr>
+        <w:rPr/>
       </w:r>
       <m:oMath xmlns:m="http://schemas.openxmlformats.org/officeDocument/2006/math">
         <m:acc>
@@ -2758,9 +2728,7 @@
         <w:t xml:space="preserve"> – координаты точки, </w:t>
       </w:r>
       <w:r>
-        <w:rPr>
-          <w:lang w:val="ru-RU"/>
-        </w:rPr>
+        <w:rPr/>
       </w:r>
       <m:oMath xmlns:m="http://schemas.openxmlformats.org/officeDocument/2006/math">
         <m:acc>
@@ -2796,9 +2764,7 @@
         <w:t xml:space="preserve">направление наблюдения, </w:t>
       </w:r>
       <w:r>
-        <w:rPr>
-          <w:lang w:val="ru-RU"/>
-        </w:rPr>
+        <w:rPr/>
       </w:r>
       <m:oMath xmlns:m="http://schemas.openxmlformats.org/officeDocument/2006/math">
         <m:acc>
@@ -2840,9 +2806,7 @@
         <w:t xml:space="preserve">направление на источник света, </w:t>
       </w:r>
       <w:r>
-        <w:rPr>
-          <w:lang w:val="az-Cyrl-AZ"/>
-        </w:rPr>
+        <w:rPr/>
       </w:r>
       <m:oMath xmlns:m="http://schemas.openxmlformats.org/officeDocument/2006/math">
         <m:r>
@@ -2978,9 +2942,7 @@
         <w:t xml:space="preserve">), </w:t>
       </w:r>
       <w:r>
-        <w:rPr>
-          <w:lang w:val="ru-RU"/>
-        </w:rPr>
+        <w:rPr/>
       </w:r>
       <m:oMath xmlns:m="http://schemas.openxmlformats.org/officeDocument/2006/math">
         <m:r>
@@ -3042,9 +3004,7 @@
         <w:t xml:space="preserve">Двунаправленная функция отражения: </w:t>
       </w:r>
       <w:r>
-        <w:rPr>
-          <w:lang w:val="ru-RU"/>
-        </w:rPr>
+        <w:rPr/>
       </w:r>
       <m:oMath xmlns:m="http://schemas.openxmlformats.org/officeDocument/2006/math">
         <m:r>
@@ -3296,9 +3256,7 @@
         <w:t xml:space="preserve">, где </w:t>
       </w:r>
       <w:r>
-        <w:rPr>
-          <w:lang w:val="ru-RU"/>
-        </w:rPr>
+        <w:rPr/>
       </w:r>
       <m:oMath xmlns:m="http://schemas.openxmlformats.org/officeDocument/2006/math">
         <m:sSub>
@@ -3339,9 +3297,7 @@
         <w:t xml:space="preserve">коэффициент диффузного отражения поверхности, </w:t>
       </w:r>
       <w:r>
-        <w:rPr>
-          <w:lang w:val="ru-RU"/>
-        </w:rPr>
+        <w:rPr/>
       </w:r>
       <m:oMath xmlns:m="http://schemas.openxmlformats.org/officeDocument/2006/math">
         <m:sSub>
@@ -3370,9 +3326,7 @@
         <w:t xml:space="preserve"> – коэффициент зеркального отражения поверхности, </w:t>
       </w:r>
       <w:r>
-        <w:rPr>
-          <w:lang w:val="ru-RU"/>
-        </w:rPr>
+        <w:rPr/>
       </w:r>
       <m:oMath xmlns:m="http://schemas.openxmlformats.org/officeDocument/2006/math">
         <m:sSub>
@@ -3401,9 +3355,7 @@
         <w:t xml:space="preserve"> – коэффициент, определяющий ширину блика, </w:t>
       </w:r>
       <w:r>
-        <w:rPr>
-          <w:lang w:val="ru-RU"/>
-        </w:rPr>
+        <w:rPr/>
       </w:r>
       <m:oMath xmlns:m="http://schemas.openxmlformats.org/officeDocument/2006/math">
         <m:acc>
@@ -3427,9 +3379,7 @@
         <w:t xml:space="preserve">– средний вектор между направлениями освещения и наблюдения, </w:t>
       </w:r>
       <w:r>
-        <w:rPr>
-          <w:lang w:val="ru-RU"/>
-        </w:rPr>
+        <w:rPr/>
       </w:r>
       <m:oMath xmlns:m="http://schemas.openxmlformats.org/officeDocument/2006/math">
         <m:acc>
@@ -3472,9 +3422,7 @@
         <w:t xml:space="preserve">Средний вектор: </w:t>
       </w:r>
       <w:r>
-        <w:rPr>
-          <w:lang w:val="ru-RU"/>
-        </w:rPr>
+        <w:rPr/>
       </w:r>
       <m:oMath xmlns:m="http://schemas.openxmlformats.org/officeDocument/2006/math">
         <m:acc>
@@ -3777,12 +3725,10 @@
           <w:t>https://github.com/vvlaads/Image-Processing-1</w:t>
         </w:r>
       </w:hyperlink>
-      <w:hyperlink r:id="rId3">
-        <w:r>
-          <w:rPr/>
-          <w:t>.</w:t>
-        </w:r>
-      </w:hyperlink>
+      <w:r>
+        <w:rPr/>
+        <w:t>.</w:t>
+      </w:r>
       <w:r>
         <w:br w:type="page"/>
       </w:r>
@@ -3832,7 +3778,7 @@
         <mc:AlternateContent>
           <mc:Choice Requires="wps">
             <w:drawing>
-              <wp:anchor behindDoc="0" distT="0" distB="0" distL="0" distR="0" simplePos="0" locked="0" layoutInCell="0" allowOverlap="1" relativeHeight="38">
+              <wp:anchor behindDoc="0" distT="0" distB="0" distL="0" distR="0" simplePos="0" locked="0" layoutInCell="0" allowOverlap="1" relativeHeight="40">
                 <wp:simplePos x="0" y="0"/>
                 <wp:positionH relativeFrom="column">
                   <wp:align>center</wp:align>
@@ -3840,7 +3786,7 @@
                 <wp:positionV relativeFrom="paragraph">
                   <wp:posOffset>635</wp:posOffset>
                 </wp:positionV>
-                <wp:extent cx="4251960" cy="4236085"/>
+                <wp:extent cx="3825240" cy="4274185"/>
                 <wp:effectExtent l="0" t="0" r="0" b="0"/>
                 <wp:wrapSquare wrapText="largest"/>
                 <wp:docPr id="4" name="Врезка4"/>
@@ -3851,7 +3797,7 @@
                       <wps:spPr>
                         <a:xfrm>
                           <a:off x="0" y="0"/>
-                          <a:ext cx="4251960" cy="4236085"/>
+                          <a:ext cx="3825240" cy="4274185"/>
                         </a:xfrm>
                         <a:prstGeom prst="rect"/>
                         <a:solidFill>
@@ -3870,7 +3816,7 @@
                               <w:rPr/>
                               <w:drawing>
                                 <wp:inline distT="0" distB="0" distL="0" distR="0">
-                                  <wp:extent cx="4251960" cy="3863340"/>
+                                  <wp:extent cx="3825240" cy="3901440"/>
                                   <wp:effectExtent l="0" t="0" r="0" b="0"/>
                                   <wp:docPr id="5" name="Изображение1" descr=""/>
                                   <wp:cNvGraphicFramePr>
@@ -3886,7 +3832,7 @@
                                           </pic:cNvPicPr>
                                         </pic:nvPicPr>
                                         <pic:blipFill>
-                                          <a:blip r:embed="rId4"/>
+                                          <a:blip r:embed="rId3"/>
                                           <a:stretch>
                                             <a:fillRect/>
                                           </a:stretch>
@@ -3894,7 +3840,7 @@
                                         <pic:spPr bwMode="auto">
                                           <a:xfrm>
                                             <a:off x="0" y="0"/>
-                                            <a:ext cx="4251960" cy="3863340"/>
+                                            <a:ext cx="3825240" cy="3901440"/>
                                           </a:xfrm>
                                           <a:prstGeom prst="rect">
                                             <a:avLst/>
@@ -3945,7 +3891,7 @@
           </mc:Choice>
           <mc:Fallback>
             <w:pict>
-              <v:rect style="position:absolute;rotation:-0;width:334.8pt;height:333.55pt;mso-wrap-distance-left:0pt;mso-wrap-distance-right:0pt;mso-wrap-distance-top:0pt;mso-wrap-distance-bottom:0pt;margin-top:0pt;mso-position-vertical:top;mso-position-vertical-relative:text;margin-left:66.45pt;mso-position-horizontal:center;mso-position-horizontal-relative:text">
+              <v:rect style="position:absolute;rotation:-0;width:301.2pt;height:336.55pt;mso-wrap-distance-left:0pt;mso-wrap-distance-right:0pt;mso-wrap-distance-top:0pt;mso-wrap-distance-bottom:0pt;margin-top:0pt;mso-position-vertical:top;mso-position-vertical-relative:text;margin-left:83.25pt;mso-position-horizontal:center;mso-position-horizontal-relative:text">
                 <v:textbox inset="0in,0in,0in,0in">
                   <w:txbxContent>
                     <w:p>
@@ -3958,7 +3904,7 @@
                         <w:rPr/>
                         <w:drawing>
                           <wp:inline distT="0" distB="0" distL="0" distR="0">
-                            <wp:extent cx="4251960" cy="3863340"/>
+                            <wp:extent cx="3825240" cy="3901440"/>
                             <wp:effectExtent l="0" t="0" r="0" b="0"/>
                             <wp:docPr id="6" name="Изображение1" descr=""/>
                             <wp:cNvGraphicFramePr>
@@ -3974,7 +3920,7 @@
                                     </pic:cNvPicPr>
                                   </pic:nvPicPr>
                                   <pic:blipFill>
-                                    <a:blip r:embed="rId5"/>
+                                    <a:blip r:embed="rId4"/>
                                     <a:stretch>
                                       <a:fillRect/>
                                     </a:stretch>
@@ -3982,7 +3928,7 @@
                                   <pic:spPr bwMode="auto">
                                     <a:xfrm>
                                       <a:off x="0" y="0"/>
-                                      <a:ext cx="4251960" cy="3863340"/>
+                                      <a:ext cx="3825240" cy="3901440"/>
                                     </a:xfrm>
                                     <a:prstGeom prst="rect">
                                       <a:avLst/>
@@ -4031,18 +3977,13 @@
     </w:p>
     <w:p>
       <w:pPr>
-        <w:pStyle w:val="Heading1"/>
-        <w:spacing w:lineRule="auto" w:line="360" w:before="0" w:after="0"/>
-        <w:ind w:left="709"/>
-        <w:jc w:val="center"/>
-        <w:rPr>
-          <w:rFonts w:eastAsia="Times New Roman" w:cs="Times New Roman"/>
-          <w:bCs/>
-          <w:color w:val="auto"/>
-        </w:rPr>
-      </w:pPr>
-      <w:r>
-        <w:rPr/>
+        <w:pStyle w:val="BodyText"/>
+        <w:spacing w:before="0" w:after="159"/>
+        <w:rPr/>
+      </w:pPr>
+      <w:r>
+        <w:rPr/>
+        <w:t>Фиолетовым цветом обозначены источники света (с направлением). Красными линиями заданы границы плоскости. Зеленым цветом обозначен наблюдатель.</w:t>
       </w:r>
       <w:r>
         <w:br w:type="page"/>
@@ -4051,7 +3992,7 @@
         <mc:AlternateContent>
           <mc:Choice Requires="wps">
             <w:drawing>
-              <wp:anchor behindDoc="0" distT="0" distB="0" distL="0" distR="0" simplePos="0" locked="0" layoutInCell="0" allowOverlap="1" relativeHeight="40">
+              <wp:anchor behindDoc="0" distT="0" distB="0" distL="0" distR="0" simplePos="0" locked="0" layoutInCell="0" allowOverlap="1" relativeHeight="42">
                 <wp:simplePos x="0" y="0"/>
                 <wp:positionH relativeFrom="column">
                   <wp:align>center</wp:align>
@@ -4059,10 +4000,10 @@
                 <wp:positionV relativeFrom="paragraph">
                   <wp:posOffset>635</wp:posOffset>
                 </wp:positionV>
-                <wp:extent cx="5490210" cy="3843020"/>
+                <wp:extent cx="5940425" cy="4166870"/>
                 <wp:effectExtent l="0" t="0" r="0" b="0"/>
                 <wp:wrapSquare wrapText="largest"/>
-                <wp:docPr id="7" name="Врезка5"/>
+                <wp:docPr id="7" name="Врезка6"/>
                 <a:graphic xmlns:a="http://schemas.openxmlformats.org/drawingml/2006/main">
                   <a:graphicData uri="http://schemas.microsoft.com/office/word/2010/wordprocessingShape">
                     <wps:wsp>
@@ -4070,7 +4011,7 @@
                       <wps:spPr>
                         <a:xfrm>
                           <a:off x="0" y="0"/>
-                          <a:ext cx="5490210" cy="3843020"/>
+                          <a:ext cx="5940425" cy="4166870"/>
                         </a:xfrm>
                         <a:prstGeom prst="rect"/>
                         <a:solidFill>
@@ -4089,9 +4030,9 @@
                               <w:rPr/>
                               <w:drawing>
                                 <wp:inline distT="0" distB="0" distL="0" distR="0">
-                                  <wp:extent cx="5490210" cy="3470275"/>
+                                  <wp:extent cx="5940425" cy="3794125"/>
                                   <wp:effectExtent l="0" t="0" r="0" b="0"/>
-                                  <wp:docPr id="8" name="Изображение2" descr=""/>
+                                  <wp:docPr id="8" name="Изображение3" descr=""/>
                                   <wp:cNvGraphicFramePr>
                                     <a:graphicFrameLocks xmlns:a="http://schemas.openxmlformats.org/drawingml/2006/main" noChangeAspect="1"/>
                                   </wp:cNvGraphicFramePr>
@@ -4099,13 +4040,13 @@
                                     <a:graphicData uri="http://schemas.openxmlformats.org/drawingml/2006/picture">
                                       <pic:pic xmlns:pic="http://schemas.openxmlformats.org/drawingml/2006/picture">
                                         <pic:nvPicPr>
-                                          <pic:cNvPr id="8" name="Изображение2" descr=""/>
+                                          <pic:cNvPr id="8" name="Изображение3" descr=""/>
                                           <pic:cNvPicPr>
                                             <a:picLocks noChangeAspect="1" noChangeArrowheads="1"/>
                                           </pic:cNvPicPr>
                                         </pic:nvPicPr>
                                         <pic:blipFill>
-                                          <a:blip r:embed="rId6"/>
+                                          <a:blip r:embed="rId5"/>
                                           <a:stretch>
                                             <a:fillRect/>
                                           </a:stretch>
@@ -4113,7 +4054,7 @@
                                         <pic:spPr bwMode="auto">
                                           <a:xfrm>
                                             <a:off x="0" y="0"/>
-                                            <a:ext cx="5490210" cy="3470275"/>
+                                            <a:ext cx="5940425" cy="3794125"/>
                                           </a:xfrm>
                                           <a:prstGeom prst="rect">
                                             <a:avLst/>
@@ -4148,7 +4089,41 @@
                             </w:r>
                             <w:r>
                               <w:rPr/>
-                              <w:t>: Вывод программы</w:t>
+                              <w:t>: Изображение в Desmos,</w:t>
+                            </w:r>
+                            <w:r>
+                              <w:rPr>
+                                <w:lang w:val="ru-RU"/>
+                              </w:rPr>
+                              <w:t xml:space="preserve"> </w:t>
+                            </w:r>
+                            <w:r>
+                              <w:rPr>
+                                <w:lang w:val="en-US"/>
+                              </w:rPr>
+                              <w:t>с</w:t>
+                            </w:r>
+                            <w:r>
+                              <w:rPr>
+                                <w:lang w:val="ru-RU"/>
+                              </w:rPr>
+                              <w:t>оответствующее</w:t>
+                            </w:r>
+                            <w:r>
+                              <w:rPr>
+                                <w:lang w:val="ru-RU"/>
+                              </w:rPr>
+                              <w:t xml:space="preserve"> </w:t>
+                            </w:r>
+                            <w:r>
+                              <w:rPr>
+                                <w:lang w:val="ru-RU"/>
+                              </w:rPr>
+                              <w:t>входным</w:t>
+                            </w:r>
+                            <w:r>
+                              <w:rPr/>
+                              <w:t xml:space="preserve"> данным</w:t>
                             </w:r>
                           </w:p>
                         </w:txbxContent>
@@ -4164,7 +4139,7 @@
           </mc:Choice>
           <mc:Fallback>
             <w:pict>
-              <v:rect style="position:absolute;rotation:-0;width:432.3pt;height:302.6pt;mso-wrap-distance-left:0pt;mso-wrap-distance-right:0pt;mso-wrap-distance-top:0pt;mso-wrap-distance-bottom:0pt;margin-top:0pt;mso-position-vertical:top;mso-position-vertical-relative:text;margin-left:17.7pt;mso-position-horizontal:center;mso-position-horizontal-relative:text">
+              <v:rect style="position:absolute;rotation:-0;width:467.75pt;height:328.1pt;mso-wrap-distance-left:0pt;mso-wrap-distance-right:0pt;mso-wrap-distance-top:0pt;mso-wrap-distance-bottom:0pt;margin-top:0pt;mso-position-vertical:top;mso-position-vertical-relative:text;margin-left:0pt;mso-position-horizontal:center;mso-position-horizontal-relative:text">
                 <v:textbox inset="0in,0in,0in,0in">
                   <w:txbxContent>
                     <w:p>
@@ -4177,9 +4152,9 @@
                         <w:rPr/>
                         <w:drawing>
                           <wp:inline distT="0" distB="0" distL="0" distR="0">
-                            <wp:extent cx="5490210" cy="3470275"/>
+                            <wp:extent cx="5940425" cy="3794125"/>
                             <wp:effectExtent l="0" t="0" r="0" b="0"/>
-                            <wp:docPr id="9" name="Изображение2" descr=""/>
+                            <wp:docPr id="9" name="Изображение3" descr=""/>
                             <wp:cNvGraphicFramePr>
                               <a:graphicFrameLocks xmlns:a="http://schemas.openxmlformats.org/drawingml/2006/main" noChangeAspect="1"/>
                             </wp:cNvGraphicFramePr>
@@ -4187,13 +4162,13 @@
                               <a:graphicData uri="http://schemas.openxmlformats.org/drawingml/2006/picture">
                                 <pic:pic xmlns:pic="http://schemas.openxmlformats.org/drawingml/2006/picture">
                                   <pic:nvPicPr>
-                                    <pic:cNvPr id="9" name="Изображение2" descr=""/>
+                                    <pic:cNvPr id="9" name="Изображение3" descr=""/>
                                     <pic:cNvPicPr>
                                       <a:picLocks noChangeAspect="1" noChangeArrowheads="1"/>
                                     </pic:cNvPicPr>
                                   </pic:nvPicPr>
                                   <pic:blipFill>
-                                    <a:blip r:embed="rId7"/>
+                                    <a:blip r:embed="rId6"/>
                                     <a:stretch>
                                       <a:fillRect/>
                                     </a:stretch>
@@ -4201,7 +4176,7 @@
                                   <pic:spPr bwMode="auto">
                                     <a:xfrm>
                                       <a:off x="0" y="0"/>
-                                      <a:ext cx="5490210" cy="3470275"/>
+                                      <a:ext cx="5940425" cy="3794125"/>
                                     </a:xfrm>
                                     <a:prstGeom prst="rect">
                                       <a:avLst/>
@@ -4236,7 +4211,41 @@
                       </w:r>
                       <w:r>
                         <w:rPr/>
-                        <w:t>: Вывод программы</w:t>
+                        <w:t>: Изображение в Desmos,</w:t>
+                      </w:r>
+                      <w:r>
+                        <w:rPr>
+                          <w:lang w:val="ru-RU"/>
+                        </w:rPr>
+                        <w:t xml:space="preserve"> </w:t>
+                      </w:r>
+                      <w:r>
+                        <w:rPr>
+                          <w:lang w:val="en-US"/>
+                        </w:rPr>
+                        <w:t>с</w:t>
+                      </w:r>
+                      <w:r>
+                        <w:rPr>
+                          <w:lang w:val="ru-RU"/>
+                        </w:rPr>
+                        <w:t>оответствующее</w:t>
+                      </w:r>
+                      <w:r>
+                        <w:rPr>
+                          <w:lang w:val="ru-RU"/>
+                        </w:rPr>
+                        <w:t xml:space="preserve"> </w:t>
+                      </w:r>
+                      <w:r>
+                        <w:rPr>
+                          <w:lang w:val="ru-RU"/>
+                        </w:rPr>
+                        <w:t>входным</w:t>
+                      </w:r>
+                      <w:r>
+                        <w:rPr/>
+                        <w:t xml:space="preserve"> данным</w:t>
                       </w:r>
                     </w:p>
                   </w:txbxContent>
@@ -4254,6 +4263,229 @@
         <w:spacing w:lineRule="auto" w:line="360" w:before="0" w:after="0"/>
         <w:ind w:left="709"/>
         <w:jc w:val="center"/>
+        <w:rPr>
+          <w:rFonts w:eastAsia="Times New Roman" w:cs="Times New Roman"/>
+          <w:bCs/>
+          <w:color w:val="auto"/>
+        </w:rPr>
+      </w:pPr>
+      <w:r>
+        <w:rPr>
+          <w:rFonts w:eastAsia="Times New Roman" w:cs="Times New Roman"/>
+          <w:bCs/>
+          <w:color w:val="auto"/>
+        </w:rPr>
+      </w:r>
+      <w:r>
+        <w:br w:type="page"/>
+      </w:r>
+      <w:r>
+        <mc:AlternateContent>
+          <mc:Choice Requires="wps">
+            <w:drawing>
+              <wp:anchor behindDoc="0" distT="0" distB="0" distL="0" distR="0" simplePos="0" locked="0" layoutInCell="0" allowOverlap="1" relativeHeight="38">
+                <wp:simplePos x="0" y="0"/>
+                <wp:positionH relativeFrom="column">
+                  <wp:align>center</wp:align>
+                </wp:positionH>
+                <wp:positionV relativeFrom="paragraph">
+                  <wp:posOffset>635</wp:posOffset>
+                </wp:positionV>
+                <wp:extent cx="5490210" cy="3745865"/>
+                <wp:effectExtent l="0" t="0" r="0" b="0"/>
+                <wp:wrapSquare wrapText="largest"/>
+                <wp:docPr id="10" name="Врезка5"/>
+                <a:graphic xmlns:a="http://schemas.openxmlformats.org/drawingml/2006/main">
+                  <a:graphicData uri="http://schemas.microsoft.com/office/word/2010/wordprocessingShape">
+                    <wps:wsp>
+                      <wps:cNvSpPr txBox="1"/>
+                      <wps:spPr>
+                        <a:xfrm>
+                          <a:off x="0" y="0"/>
+                          <a:ext cx="5490210" cy="3745865"/>
+                        </a:xfrm>
+                        <a:prstGeom prst="rect"/>
+                        <a:solidFill>
+                          <a:srgbClr val="FFFFFF"/>
+                        </a:solidFill>
+                      </wps:spPr>
+                      <wps:txbx>
+                        <w:txbxContent>
+                          <w:p>
+                            <w:pPr>
+                              <w:pStyle w:val="Style21"/>
+                              <w:spacing w:before="120" w:after="120"/>
+                              <w:rPr/>
+                            </w:pPr>
+                            <w:r>
+                              <w:rPr/>
+                              <w:drawing>
+                                <wp:inline distT="0" distB="0" distL="0" distR="0">
+                                  <wp:extent cx="5490210" cy="3373120"/>
+                                  <wp:effectExtent l="0" t="0" r="0" b="0"/>
+                                  <wp:docPr id="11" name="Изображение2" descr=""/>
+                                  <wp:cNvGraphicFramePr>
+                                    <a:graphicFrameLocks xmlns:a="http://schemas.openxmlformats.org/drawingml/2006/main" noChangeAspect="1"/>
+                                  </wp:cNvGraphicFramePr>
+                                  <a:graphic xmlns:a="http://schemas.openxmlformats.org/drawingml/2006/main">
+                                    <a:graphicData uri="http://schemas.openxmlformats.org/drawingml/2006/picture">
+                                      <pic:pic xmlns:pic="http://schemas.openxmlformats.org/drawingml/2006/picture">
+                                        <pic:nvPicPr>
+                                          <pic:cNvPr id="11" name="Изображение2" descr=""/>
+                                          <pic:cNvPicPr>
+                                            <a:picLocks noChangeAspect="1" noChangeArrowheads="1"/>
+                                          </pic:cNvPicPr>
+                                        </pic:nvPicPr>
+                                        <pic:blipFill>
+                                          <a:blip r:embed="rId7"/>
+                                          <a:stretch>
+                                            <a:fillRect/>
+                                          </a:stretch>
+                                        </pic:blipFill>
+                                        <pic:spPr bwMode="auto">
+                                          <a:xfrm>
+                                            <a:off x="0" y="0"/>
+                                            <a:ext cx="5490210" cy="3373120"/>
+                                          </a:xfrm>
+                                          <a:prstGeom prst="rect">
+                                            <a:avLst/>
+                                          </a:prstGeom>
+                                        </pic:spPr>
+                                      </pic:pic>
+                                    </a:graphicData>
+                                  </a:graphic>
+                                </wp:inline>
+                              </w:drawing>
+                              <w:t xml:space="preserve">Рисунок </w:t>
+                            </w:r>
+                            <w:r>
+                              <w:rPr/>
+                              <w:fldChar w:fldCharType="begin"/>
+                            </w:r>
+                            <w:r>
+                              <w:rPr/>
+                              <w:instrText xml:space="preserve"> SEQ Рисунок \* ARABIC </w:instrText>
+                            </w:r>
+                            <w:r>
+                              <w:rPr/>
+                              <w:fldChar w:fldCharType="separate"/>
+                            </w:r>
+                            <w:r>
+                              <w:rPr/>
+                              <w:t>3</w:t>
+                            </w:r>
+                            <w:r>
+                              <w:rPr/>
+                              <w:fldChar w:fldCharType="end"/>
+                            </w:r>
+                            <w:r>
+                              <w:rPr/>
+                              <w:t>: Пример работы программы</w:t>
+                            </w:r>
+                          </w:p>
+                        </w:txbxContent>
+                      </wps:txbx>
+                      <wps:bodyPr anchor="t" lIns="0" tIns="0" rIns="0" bIns="0">
+                        <a:noAutofit/>
+                      </wps:bodyPr>
+                    </wps:wsp>
+                  </a:graphicData>
+                </a:graphic>
+              </wp:anchor>
+            </w:drawing>
+          </mc:Choice>
+          <mc:Fallback>
+            <w:pict>
+              <v:rect style="position:absolute;rotation:-0;width:432.3pt;height:294.95pt;mso-wrap-distance-left:0pt;mso-wrap-distance-right:0pt;mso-wrap-distance-top:0pt;mso-wrap-distance-bottom:0pt;margin-top:0pt;mso-position-vertical:top;mso-position-vertical-relative:text;margin-left:17.7pt;mso-position-horizontal:center;mso-position-horizontal-relative:text">
+                <v:textbox inset="0in,0in,0in,0in">
+                  <w:txbxContent>
+                    <w:p>
+                      <w:pPr>
+                        <w:pStyle w:val="Style21"/>
+                        <w:spacing w:before="120" w:after="120"/>
+                        <w:rPr/>
+                      </w:pPr>
+                      <w:r>
+                        <w:rPr/>
+                        <w:drawing>
+                          <wp:inline distT="0" distB="0" distL="0" distR="0">
+                            <wp:extent cx="5490210" cy="3373120"/>
+                            <wp:effectExtent l="0" t="0" r="0" b="0"/>
+                            <wp:docPr id="12" name="Изображение2" descr=""/>
+                            <wp:cNvGraphicFramePr>
+                              <a:graphicFrameLocks xmlns:a="http://schemas.openxmlformats.org/drawingml/2006/main" noChangeAspect="1"/>
+                            </wp:cNvGraphicFramePr>
+                            <a:graphic xmlns:a="http://schemas.openxmlformats.org/drawingml/2006/main">
+                              <a:graphicData uri="http://schemas.openxmlformats.org/drawingml/2006/picture">
+                                <pic:pic xmlns:pic="http://schemas.openxmlformats.org/drawingml/2006/picture">
+                                  <pic:nvPicPr>
+                                    <pic:cNvPr id="12" name="Изображение2" descr=""/>
+                                    <pic:cNvPicPr>
+                                      <a:picLocks noChangeAspect="1" noChangeArrowheads="1"/>
+                                    </pic:cNvPicPr>
+                                  </pic:nvPicPr>
+                                  <pic:blipFill>
+                                    <a:blip r:embed="rId8"/>
+                                    <a:stretch>
+                                      <a:fillRect/>
+                                    </a:stretch>
+                                  </pic:blipFill>
+                                  <pic:spPr bwMode="auto">
+                                    <a:xfrm>
+                                      <a:off x="0" y="0"/>
+                                      <a:ext cx="5490210" cy="3373120"/>
+                                    </a:xfrm>
+                                    <a:prstGeom prst="rect">
+                                      <a:avLst/>
+                                    </a:prstGeom>
+                                  </pic:spPr>
+                                </pic:pic>
+                              </a:graphicData>
+                            </a:graphic>
+                          </wp:inline>
+                        </w:drawing>
+                        <w:t xml:space="preserve">Рисунок </w:t>
+                      </w:r>
+                      <w:r>
+                        <w:rPr/>
+                        <w:fldChar w:fldCharType="begin"/>
+                      </w:r>
+                      <w:r>
+                        <w:rPr/>
+                        <w:instrText xml:space="preserve"> SEQ Рисунок \* ARABIC </w:instrText>
+                      </w:r>
+                      <w:r>
+                        <w:rPr/>
+                        <w:fldChar w:fldCharType="separate"/>
+                      </w:r>
+                      <w:r>
+                        <w:rPr/>
+                        <w:t>3</w:t>
+                      </w:r>
+                      <w:r>
+                        <w:rPr/>
+                        <w:fldChar w:fldCharType="end"/>
+                      </w:r>
+                      <w:r>
+                        <w:rPr/>
+                        <w:t>: Пример работы программы</w:t>
+                      </w:r>
+                    </w:p>
+                  </w:txbxContent>
+                </v:textbox>
+                <w10:wrap type="square" side="largest"/>
+              </v:rect>
+            </w:pict>
+          </mc:Fallback>
+        </mc:AlternateContent>
+      </w:r>
+    </w:p>
+    <w:p>
+      <w:pPr>
+        <w:pStyle w:val="Heading1"/>
+        <w:spacing w:lineRule="auto" w:line="360" w:before="0" w:after="0"/>
+        <w:ind w:left="709"/>
+        <w:jc w:val="center"/>
         <w:rPr/>
       </w:pPr>
       <w:bookmarkStart w:id="9" w:name="__RefHeading___Toc644_3412834385"/>
@@ -4345,16 +4577,14 @@
         </w:rPr>
         <w:t xml:space="preserve">Д. Д. Жданов, И. С. Потемин, А. Д. Жданов "Теоретические основы компьютерной графики и вычислительной оптики" учебно-методическое пособие ИТМО 2023 </w:t>
       </w:r>
-      <w:hyperlink r:id="rId9">
-        <w:r>
-          <w:rPr>
-            <w:rStyle w:val="Hyperlink"/>
-            <w:rFonts w:eastAsia="Times New Roman" w:cs="Times New Roman"/>
-            <w:szCs w:val="28"/>
-          </w:rPr>
-          <w:t>https://books.ifmo.ru/file/pdf/3281.pdf</w:t>
-        </w:r>
-      </w:hyperlink>
+      <w:r>
+        <w:rPr>
+          <w:rStyle w:val="Hyperlink"/>
+          <w:rFonts w:eastAsia="Times New Roman" w:cs="Times New Roman"/>
+          <w:szCs w:val="28"/>
+        </w:rPr>
+        <w:t>https://books.ifmo.ru/file/pdf/3281.pdf</w:t>
+      </w:r>
     </w:p>
     <w:p>
       <w:pPr>
@@ -4374,7 +4604,7 @@
         </w:rPr>
         <w:t xml:space="preserve">Д. Д. Жданов, И. С. Потемин, А. Д. Жданов "Методы расчёта глобальной освещённости" учебно-методическое пособие ИТМО 2023 </w:t>
       </w:r>
-      <w:hyperlink r:id="rId10">
+      <w:hyperlink r:id="rId9">
         <w:r>
           <w:rPr>
             <w:rStyle w:val="Hyperlink"/>
@@ -4384,21 +4614,19 @@
           <w:t>https://books.ifmo.ru/file/pdf/3275.pdf</w:t>
         </w:r>
       </w:hyperlink>
-      <w:hyperlink r:id="rId11">
-        <w:r>
-          <w:rPr>
-            <w:rFonts w:eastAsia="Times New Roman" w:cs="Times New Roman"/>
-            <w:szCs w:val="28"/>
-          </w:rPr>
-          <w:br/>
-        </w:r>
-      </w:hyperlink>
+      <w:r>
+        <w:rPr>
+          <w:rFonts w:eastAsia="Times New Roman" w:cs="Times New Roman"/>
+          <w:szCs w:val="28"/>
+        </w:rPr>
+        <w:br/>
+      </w:r>
     </w:p>
     <w:sectPr>
-      <w:headerReference w:type="default" r:id="rId12"/>
-      <w:headerReference w:type="first" r:id="rId13"/>
-      <w:footerReference w:type="default" r:id="rId14"/>
-      <w:footerReference w:type="first" r:id="rId15"/>
+      <w:headerReference w:type="default" r:id="rId10"/>
+      <w:headerReference w:type="first" r:id="rId11"/>
+      <w:footerReference w:type="default" r:id="rId12"/>
+      <w:footerReference w:type="first" r:id="rId13"/>
       <w:type w:val="nextPage"/>
       <w:pgSz w:w="11906" w:h="16838"/>
       <w:pgMar w:left="1701" w:right="850" w:gutter="0" w:header="1134" w:top="1548" w:footer="1134" w:bottom="1548"/>
@@ -4478,7 +4706,7 @@
           </w:r>
           <w:r>
             <w:rPr/>
-            <w:t>10</w:t>
+            <w:t>11</w:t>
           </w:r>
           <w:r>
             <w:rPr/>

</xml_diff>